<commit_message>
update practical reports with output screenshots
</commit_message>
<xml_diff>
--- a/reports/D26IT113-PR10.docx
+++ b/reports/D26IT113-PR10.docx
@@ -133,11 +133,11 @@
               <a:graphicData uri="http://schemas.openxmlformats.org/drawingml/2006/picture">
                 <pic:pic>
                   <pic:nvPicPr>
-                    <pic:cNvPr id="0" name="pr10_login.png"/>
+                    <pic:cNvPr id="0" name="pr10_dashboard.png"/>
                     <pic:cNvPicPr/>
                   </pic:nvPicPr>
                   <pic:blipFill>
-                    <a:blip r:embed="rId24"/>
+                    <a:blip r:embed="rId25"/>
                     <a:stretch>
                       <a:fillRect/>
                     </a:stretch>

</xml_diff>